<commit_message>
Update links and Chinese translation
</commit_message>
<xml_diff>
--- a/FY2025/FY2025_US_State_HFA_ACFR_Analysis_Report.docx
+++ b/FY2025/FY2025_US_State_HFA_ACFR_Analysis_Report.docx
@@ -14,7 +14,7 @@
         </w:rPr>
         <w:t>FY2025 U.S. State Housing Finance Agencies</w:t>
         <w:br/>
-        <w:t>ACFR &amp; Financial Statements: Panoramic Analysis &amp; Strategic Insights</w:t>
+        <w:t>ACFR and Financial Statement Analysis</w:t>
       </w:r>
     </w:p>
     <w:p>
@@ -33,22 +33,22 @@
         <w:pStyle w:val="Heading1"/>
       </w:pPr>
       <w:r>
-        <w:t>I. Executive Summary: A Balance-Sheet Moment for Housing Finance</w:t>
+        <w:t>I. Executive Summary</w:t>
       </w:r>
     </w:p>
     <w:p>
       <w:r>
-        <w:t>FY2025 (year ended June 30, 2025; some agencies use a calendar year) was a pivotal financial year for State Housing Finance Agencies (HFAs) amid falling interest rates, intensifying LIHTC competition, and expanding first-time homebuyer programs. This report systematically collects and compares publicly disclosed ACFRs and audited financial statements across all 51 states and territories. As of the collection date, 43 FY2025 reports were obtained (84% coverage).</w:t>
+        <w:t>Fiscal year 2025 (year ended June 30, 2025 for most agencies; a few report on a calendar year) was a consequential period for State Housing Finance Agencies (HFAs). Interest rates eased, competition for Low-Income Housing Tax Credits (LIHTC) intensified, and first-time homebuyer programs continued to expand. This report compiles and compares publicly available ACFRs and audited financial statements for HFAs across all 51 states and the District of Columbia. As of the preparation date, 43 FY2025 reports were obtained (84% coverage).</w:t>
       </w:r>
     </w:p>
     <w:p>
       <w:r>
-        <w:t>Key finding: Among 29 agencies with extracted data, aggregate net position totals approximately $35.89B, and aggregate total assets approximately $111.18B. State HFAs operate as quasi-banks funded by bonds—mortgage and development loans on the asset side, housing bonds on the liability side. Net position ratio (Net Position / Total Assets) measures financial cushion and resilience.</w:t>
+        <w:t>Among 42 agencies with extracted metrics, aggregate net position is approximately $42.76B and aggregate total assets approximately $147.97B. State HFAs function largely as bond-financed intermediaries: mortgage and development loans on the asset side, and housing bonds on the liability side. The net position ratio (net position divided by total assets) is a useful indicator of financial cushion and resilience.</w:t>
       </w:r>
     </w:p>
     <w:p>
       <w:r>
-        <w:t>Growth leader: LA (LHC) posted net position growth of +31.9%, reaching $821.7M. This typically reflects rebounding bond issuance, portfolio expansion, or fair-value recovery—but should be cross-checked against housing units financed.</w:t>
+        <w:t>The strongest year-over-year increase in net position was recorded by LA (LHC), at +31.9%, bringing net position to $821.7M. Such gains often coincide with higher bond issuance, portfolio growth, or fair-value recovery, and should be interpreted alongside housing production measures (for example, units financed).</w:t>
       </w:r>
     </w:p>
     <w:p>
@@ -56,7 +56,7 @@
         <w:pStyle w:val="Heading1"/>
       </w:pPr>
       <w:r>
-        <w:t>II. Rankings: Who Is Getting Bigger, Stronger, and Faster</w:t>
+        <w:t>II. Rankings</w:t>
       </w:r>
     </w:p>
     <w:p>
@@ -64,7 +64,7 @@
         <w:pStyle w:val="Heading2"/>
       </w:pPr>
       <w:r>
-        <w:t>2.1 Top 10 by Net Position (Financial Heavyweights)</w:t>
+        <w:t>2.1 Top 10 by Net Position</w:t>
       </w:r>
     </w:p>
     <w:tbl>
@@ -470,7 +470,7 @@
           </w:tcPr>
           <w:p>
             <w:r>
-              <w:t>MN</w:t>
+              <w:t>IA</w:t>
             </w:r>
           </w:p>
         </w:tc>
@@ -480,7 +480,7 @@
           </w:tcPr>
           <w:p>
             <w:r>
-              <w:t>MNHousing</w:t>
+              <w:t>IFA</w:t>
             </w:r>
           </w:p>
         </w:tc>
@@ -490,7 +490,7 @@
           </w:tcPr>
           <w:p>
             <w:r>
-              <w:t>$1,649.4M</w:t>
+              <w:t>$1,664.6M</w:t>
             </w:r>
           </w:p>
         </w:tc>
@@ -500,7 +500,7 @@
           </w:tcPr>
           <w:p>
             <w:r>
-              <w:t>$8,543.3M</w:t>
+              <w:t>$6,173.2M</w:t>
             </w:r>
           </w:p>
         </w:tc>
@@ -510,7 +510,7 @@
           </w:tcPr>
           <w:p>
             <w:r>
-              <w:t>+19.3%</w:t>
+              <w:t>+27.0%</w:t>
             </w:r>
           </w:p>
         </w:tc>
@@ -532,7 +532,7 @@
           </w:tcPr>
           <w:p>
             <w:r>
-              <w:t>IL</w:t>
+              <w:t>MN</w:t>
             </w:r>
           </w:p>
         </w:tc>
@@ -542,7 +542,7 @@
           </w:tcPr>
           <w:p>
             <w:r>
-              <w:t>IHDA</w:t>
+              <w:t>MNHousing</w:t>
             </w:r>
           </w:p>
         </w:tc>
@@ -552,7 +552,7 @@
           </w:tcPr>
           <w:p>
             <w:r>
-              <w:t>$1,533.7M</w:t>
+              <w:t>$1,649.4M</w:t>
             </w:r>
           </w:p>
         </w:tc>
@@ -562,7 +562,7 @@
           </w:tcPr>
           <w:p>
             <w:r>
-              <w:t>$7,846.5M</w:t>
+              <w:t>$8,543.3M</w:t>
             </w:r>
           </w:p>
         </w:tc>
@@ -572,7 +572,7 @@
           </w:tcPr>
           <w:p>
             <w:r>
-              <w:t>+19.5%</w:t>
+              <w:t>+19.3%</w:t>
             </w:r>
           </w:p>
         </w:tc>
@@ -594,7 +594,7 @@
           </w:tcPr>
           <w:p>
             <w:r>
-              <w:t>MI</w:t>
+              <w:t>IL</w:t>
             </w:r>
           </w:p>
         </w:tc>
@@ -604,7 +604,7 @@
           </w:tcPr>
           <w:p>
             <w:r>
-              <w:t>MSHDA</w:t>
+              <w:t>IHDA</w:t>
             </w:r>
           </w:p>
         </w:tc>
@@ -614,7 +614,7 @@
           </w:tcPr>
           <w:p>
             <w:r>
-              <w:t>$1,292.0M</w:t>
+              <w:t>$1,533.7M</w:t>
             </w:r>
           </w:p>
         </w:tc>
@@ -624,7 +624,7 @@
           </w:tcPr>
           <w:p>
             <w:r>
-              <w:t>$8,027.8M</w:t>
+              <w:t>$7,846.5M</w:t>
             </w:r>
           </w:p>
         </w:tc>
@@ -634,7 +634,7 @@
           </w:tcPr>
           <w:p>
             <w:r>
-              <w:t>+16.1%</w:t>
+              <w:t>+19.5%</w:t>
             </w:r>
           </w:p>
         </w:tc>
@@ -656,7 +656,7 @@
           </w:tcPr>
           <w:p>
             <w:r>
-              <w:t>WI</w:t>
+              <w:t>MI</w:t>
             </w:r>
           </w:p>
         </w:tc>
@@ -666,7 +666,7 @@
           </w:tcPr>
           <w:p>
             <w:r>
-              <w:t>WHEDA</w:t>
+              <w:t>MSHDA</w:t>
             </w:r>
           </w:p>
         </w:tc>
@@ -676,7 +676,7 @@
           </w:tcPr>
           <w:p>
             <w:r>
-              <w:t>$1,134.1M</w:t>
+              <w:t>$1,292.0M</w:t>
             </w:r>
           </w:p>
         </w:tc>
@@ -686,7 +686,7 @@
           </w:tcPr>
           <w:p>
             <w:r>
-              <w:t>$4,467.4M</w:t>
+              <w:t>$8,027.8M</w:t>
             </w:r>
           </w:p>
         </w:tc>
@@ -696,7 +696,7 @@
           </w:tcPr>
           <w:p>
             <w:r>
-              <w:t>+25.4%</w:t>
+              <w:t>+16.1%</w:t>
             </w:r>
           </w:p>
         </w:tc>
@@ -718,7 +718,7 @@
           </w:tcPr>
           <w:p>
             <w:r>
-              <w:t>TX</w:t>
+              <w:t>WI</w:t>
             </w:r>
           </w:p>
         </w:tc>
@@ -728,7 +728,7 @@
           </w:tcPr>
           <w:p>
             <w:r>
-              <w:t>TDHCA</w:t>
+              <w:t>WHEDA</w:t>
             </w:r>
           </w:p>
         </w:tc>
@@ -738,7 +738,7 @@
           </w:tcPr>
           <w:p>
             <w:r>
-              <w:t>$1,079.0M</w:t>
+              <w:t>$1,134.1M</w:t>
             </w:r>
           </w:p>
         </w:tc>
@@ -748,7 +748,7 @@
           </w:tcPr>
           <w:p>
             <w:r>
-              <w:t>$4,742.6M</w:t>
+              <w:t>$4,467.4M</w:t>
             </w:r>
           </w:p>
         </w:tc>
@@ -758,7 +758,7 @@
           </w:tcPr>
           <w:p>
             <w:r>
-              <w:t>+22.8%</w:t>
+              <w:t>+25.4%</w:t>
             </w:r>
           </w:p>
         </w:tc>
@@ -766,7 +766,7 @@
     </w:tbl>
     <w:p>
       <w:r>
-        <w:t>Insight: The largest net-position agencies are often dual-engine players in multifamily housing revenue bonds (MHRB) and single-family mortgage programs. Scale alone does not equal performance, but it signals stronger bargaining power, lower marginal borrowing costs, and capacity to underwrite large affordable housing deals when federal policy shifts.</w:t>
+        <w:t>Florida, Virginia, and California lead by net position, followed by Hawaii and Massachusetts. Larger agencies typically operate both multifamily housing revenue bond and single-family mortgage programs. Size is not a performance scorecard, but it often correlates with stronger market access, lower marginal funding costs, and greater capacity to finance large affordable housing transactions when federal policy shifts.</w:t>
       </w:r>
     </w:p>
     <w:p>
@@ -774,7 +774,7 @@
         <w:pStyle w:val="Heading2"/>
       </w:pPr>
       <w:r>
-        <w:t>2.2 Top 10 by Net Position Growth (Financial Acceleration)</w:t>
+        <w:t>2.2 Top 10 by Net Position Growth</w:t>
       </w:r>
     </w:p>
     <w:tbl>
@@ -890,7 +890,7 @@
           </w:tcPr>
           <w:p>
             <w:r>
-              <w:t>N/A</w:t>
+              <w:t>$198.7M</w:t>
             </w:r>
           </w:p>
         </w:tc>
@@ -932,7 +932,7 @@
           </w:tcPr>
           <w:p>
             <w:r>
-              <w:t>IN</w:t>
+              <w:t>CT</w:t>
             </w:r>
           </w:p>
         </w:tc>
@@ -942,7 +942,7 @@
           </w:tcPr>
           <w:p>
             <w:r>
-              <w:t>IHCDA</w:t>
+              <w:t>CHFA</w:t>
             </w:r>
           </w:p>
         </w:tc>
@@ -952,7 +952,7 @@
           </w:tcPr>
           <w:p>
             <w:r>
-              <w:t>N/A</w:t>
+              <w:t>$192.6M</w:t>
             </w:r>
           </w:p>
         </w:tc>
@@ -962,7 +962,7 @@
           </w:tcPr>
           <w:p>
             <w:r>
-              <w:t>+20.4%</w:t>
+              <w:t>+25.2%</w:t>
             </w:r>
           </w:p>
         </w:tc>
@@ -972,7 +972,7 @@
           </w:tcPr>
           <w:p>
             <w:r>
-              <w:t>$599.5M</w:t>
+              <w:t>$957.0M</w:t>
             </w:r>
           </w:p>
         </w:tc>
@@ -994,7 +994,7 @@
           </w:tcPr>
           <w:p>
             <w:r>
-              <w:t>OH</w:t>
+              <w:t>IN</w:t>
             </w:r>
           </w:p>
         </w:tc>
@@ -1004,7 +1004,7 @@
           </w:tcPr>
           <w:p>
             <w:r>
-              <w:t>OHFA</w:t>
+              <w:t>IHCDA</w:t>
             </w:r>
           </w:p>
         </w:tc>
@@ -1014,7 +1014,7 @@
           </w:tcPr>
           <w:p>
             <w:r>
-              <w:t>$87.1M</w:t>
+              <w:t>$101.6M</w:t>
             </w:r>
           </w:p>
         </w:tc>
@@ -1024,7 +1024,7 @@
           </w:tcPr>
           <w:p>
             <w:r>
-              <w:t>+19.8%</w:t>
+              <w:t>+20.4%</w:t>
             </w:r>
           </w:p>
         </w:tc>
@@ -1034,7 +1034,7 @@
           </w:tcPr>
           <w:p>
             <w:r>
-              <w:t>$526.1M</w:t>
+              <w:t>$599.5M</w:t>
             </w:r>
           </w:p>
         </w:tc>
@@ -1056,7 +1056,7 @@
           </w:tcPr>
           <w:p>
             <w:r>
-              <w:t>WI</w:t>
+              <w:t>OH</w:t>
             </w:r>
           </w:p>
         </w:tc>
@@ -1066,7 +1066,7 @@
           </w:tcPr>
           <w:p>
             <w:r>
-              <w:t>WHEDA</w:t>
+              <w:t>OHFA</w:t>
             </w:r>
           </w:p>
         </w:tc>
@@ -1076,7 +1076,7 @@
           </w:tcPr>
           <w:p>
             <w:r>
-              <w:t>$169.9M</w:t>
+              <w:t>$86.9M</w:t>
             </w:r>
           </w:p>
         </w:tc>
@@ -1086,7 +1086,7 @@
           </w:tcPr>
           <w:p>
             <w:r>
-              <w:t>+17.6%</w:t>
+              <w:t>+19.8%</w:t>
             </w:r>
           </w:p>
         </w:tc>
@@ -1096,7 +1096,7 @@
           </w:tcPr>
           <w:p>
             <w:r>
-              <w:t>$1,134.1M</w:t>
+              <w:t>$526.1M</w:t>
             </w:r>
           </w:p>
         </w:tc>
@@ -1118,7 +1118,7 @@
           </w:tcPr>
           <w:p>
             <w:r>
-              <w:t>MA</w:t>
+              <w:t>MN</w:t>
             </w:r>
           </w:p>
         </w:tc>
@@ -1128,7 +1128,7 @@
           </w:tcPr>
           <w:p>
             <w:r>
-              <w:t>MassHousing</w:t>
+              <w:t>MNHousing</w:t>
             </w:r>
           </w:p>
         </w:tc>
@@ -1138,7 +1138,7 @@
           </w:tcPr>
           <w:p>
             <w:r>
-              <w:t>N/A</w:t>
+              <w:t>$259.9M</w:t>
             </w:r>
           </w:p>
         </w:tc>
@@ -1148,7 +1148,7 @@
           </w:tcPr>
           <w:p>
             <w:r>
-              <w:t>+14.3%</w:t>
+              <w:t>+18.7%</w:t>
             </w:r>
           </w:p>
         </w:tc>
@@ -1158,7 +1158,7 @@
           </w:tcPr>
           <w:p>
             <w:r>
-              <w:t>$2,083.9M</w:t>
+              <w:t>$1,649.4M</w:t>
             </w:r>
           </w:p>
         </w:tc>
@@ -1180,7 +1180,7 @@
           </w:tcPr>
           <w:p>
             <w:r>
-              <w:t>NC</w:t>
+              <w:t>UT</w:t>
             </w:r>
           </w:p>
         </w:tc>
@@ -1190,7 +1190,7 @@
           </w:tcPr>
           <w:p>
             <w:r>
-              <w:t>NCHFA</w:t>
+              <w:t>UtahHousing</w:t>
             </w:r>
           </w:p>
         </w:tc>
@@ -1200,7 +1200,7 @@
           </w:tcPr>
           <w:p>
             <w:r>
-              <w:t>N/A</w:t>
+              <w:t>$96.2M</w:t>
             </w:r>
           </w:p>
         </w:tc>
@@ -1210,7 +1210,7 @@
           </w:tcPr>
           <w:p>
             <w:r>
-              <w:t>+14.3%</w:t>
+              <w:t>+18.7%</w:t>
             </w:r>
           </w:p>
         </w:tc>
@@ -1220,7 +1220,7 @@
           </w:tcPr>
           <w:p>
             <w:r>
-              <w:t>$979.8M</w:t>
+              <w:t>$610.6M</w:t>
             </w:r>
           </w:p>
         </w:tc>
@@ -1242,7 +1242,7 @@
           </w:tcPr>
           <w:p>
             <w:r>
-              <w:t>HI</w:t>
+              <w:t>WI</w:t>
             </w:r>
           </w:p>
         </w:tc>
@@ -1252,7 +1252,7 @@
           </w:tcPr>
           <w:p>
             <w:r>
-              <w:t>HHFDC</w:t>
+              <w:t>WHEDA</w:t>
             </w:r>
           </w:p>
         </w:tc>
@@ -1262,7 +1262,7 @@
           </w:tcPr>
           <w:p>
             <w:r>
-              <w:t>N/A</w:t>
+              <w:t>$169.7M</w:t>
             </w:r>
           </w:p>
         </w:tc>
@@ -1272,7 +1272,7 @@
           </w:tcPr>
           <w:p>
             <w:r>
-              <w:t>+13.8%</w:t>
+              <w:t>+17.6%</w:t>
             </w:r>
           </w:p>
         </w:tc>
@@ -1282,7 +1282,7 @@
           </w:tcPr>
           <w:p>
             <w:r>
-              <w:t>$2,653.2M</w:t>
+              <w:t>$1,134.1M</w:t>
             </w:r>
           </w:p>
         </w:tc>
@@ -1304,7 +1304,7 @@
           </w:tcPr>
           <w:p>
             <w:r>
-              <w:t>WA</w:t>
+              <w:t>CO</w:t>
             </w:r>
           </w:p>
         </w:tc>
@@ -1314,7 +1314,7 @@
           </w:tcPr>
           <w:p>
             <w:r>
-              <w:t>WSHFC</w:t>
+              <w:t>CHFA</w:t>
             </w:r>
           </w:p>
         </w:tc>
@@ -1324,7 +1324,7 @@
           </w:tcPr>
           <w:p>
             <w:r>
-              <w:t>$128.5M</w:t>
+              <w:t>$143.3M</w:t>
             </w:r>
           </w:p>
         </w:tc>
@@ -1334,7 +1334,7 @@
           </w:tcPr>
           <w:p>
             <w:r>
-              <w:t>+13.7%</w:t>
+              <w:t>+17.3%</w:t>
             </w:r>
           </w:p>
         </w:tc>
@@ -1344,7 +1344,7 @@
           </w:tcPr>
           <w:p>
             <w:r>
-              <w:t>$1,064.1M</w:t>
+              <w:t>$971.7M</w:t>
             </w:r>
           </w:p>
         </w:tc>
@@ -1366,7 +1366,7 @@
           </w:tcPr>
           <w:p>
             <w:r>
-              <w:t>FL</w:t>
+              <w:t>MA</w:t>
             </w:r>
           </w:p>
         </w:tc>
@@ -1376,7 +1376,7 @@
           </w:tcPr>
           <w:p>
             <w:r>
-              <w:t>FloridaHousing</w:t>
+              <w:t>MassHousing</w:t>
             </w:r>
           </w:p>
         </w:tc>
@@ -1386,7 +1386,7 @@
           </w:tcPr>
           <w:p>
             <w:r>
-              <w:t>$558.3M</w:t>
+              <w:t>$260.7M</w:t>
             </w:r>
           </w:p>
         </w:tc>
@@ -1396,7 +1396,7 @@
           </w:tcPr>
           <w:p>
             <w:r>
-              <w:t>+13.2%</w:t>
+              <w:t>+14.3%</w:t>
             </w:r>
           </w:p>
         </w:tc>
@@ -1406,7 +1406,7 @@
           </w:tcPr>
           <w:p>
             <w:r>
-              <w:t>$4,771.1M</w:t>
+              <w:t>$2,083.9M</w:t>
             </w:r>
           </w:p>
         </w:tc>
@@ -1428,7 +1428,7 @@
           </w:tcPr>
           <w:p>
             <w:r>
-              <w:t>IL</w:t>
+              <w:t>NC</w:t>
             </w:r>
           </w:p>
         </w:tc>
@@ -1438,7 +1438,7 @@
           </w:tcPr>
           <w:p>
             <w:r>
-              <w:t>IHDA</w:t>
+              <w:t>NCHFA</w:t>
             </w:r>
           </w:p>
         </w:tc>
@@ -1448,7 +1448,7 @@
           </w:tcPr>
           <w:p>
             <w:r>
-              <w:t>$159.9M</w:t>
+              <w:t>$122.6M</w:t>
             </w:r>
           </w:p>
         </w:tc>
@@ -1458,7 +1458,7 @@
           </w:tcPr>
           <w:p>
             <w:r>
-              <w:t>+11.6%</w:t>
+              <w:t>+14.3%</w:t>
             </w:r>
           </w:p>
         </w:tc>
@@ -1468,7 +1468,7 @@
           </w:tcPr>
           <w:p>
             <w:r>
-              <w:t>$1,533.7M</w:t>
+              <w:t>$979.8M</w:t>
             </w:r>
           </w:p>
         </w:tc>
@@ -1476,7 +1476,7 @@
     </w:tbl>
     <w:p>
       <w:r>
-        <w:t>Insight: High-growth states often fall into three scenarios: (1) bond issuance rebound; (2) loan-loss reserve releases or fair-value gains; (3) state down-payment/homeownership programs improving fees and spreads. Caution: growth driven by fair-value gains rather than operating surplus may be less sustainable.</w:t>
+        <w:t>Louisiana recorded the highest year-over-year net position growth, with Connecticut, Indiana, Ohio, Minnesota, and Utah also posting gains in the mid-teens to mid-20s. Rapid growth commonly reflects a rebound in bond issuance, releases of loan-loss reserves or fair-value gains, or stronger fee and spread income from state homebuyer programs. Gains driven mainly by fair-value changes rather than operating results may prove less durable.</w:t>
       </w:r>
     </w:p>
     <w:p>
@@ -1484,7 +1484,7 @@
         <w:pStyle w:val="Heading2"/>
       </w:pPr>
       <w:r>
-        <w:t>2.3 Top 10 by Total Assets (Market Anchors)</w:t>
+        <w:t>2.3 Top 10 by Total Assets</w:t>
       </w:r>
     </w:p>
     <w:tbl>
@@ -1725,37 +1725,37 @@
           </w:tcPr>
           <w:p>
             <w:r>
-              <w:t>MA</w:t>
-            </w:r>
-          </w:p>
-        </w:tc>
-        <w:tc>
-          <w:tcPr>
-            <w:tcW w:type="dxa" w:w="1728"/>
-          </w:tcPr>
-          <w:p>
-            <w:r>
-              <w:t>MassHousing</w:t>
-            </w:r>
-          </w:p>
-        </w:tc>
-        <w:tc>
-          <w:tcPr>
-            <w:tcW w:type="dxa" w:w="1728"/>
-          </w:tcPr>
-          <w:p>
-            <w:r>
-              <w:t>$8,079.7M</w:t>
-            </w:r>
-          </w:p>
-        </w:tc>
-        <w:tc>
-          <w:tcPr>
-            <w:tcW w:type="dxa" w:w="1728"/>
-          </w:tcPr>
-          <w:p>
-            <w:r>
-              <w:t>$2,083.9M</w:t>
+              <w:t>CT</w:t>
+            </w:r>
+          </w:p>
+        </w:tc>
+        <w:tc>
+          <w:tcPr>
+            <w:tcW w:type="dxa" w:w="1728"/>
+          </w:tcPr>
+          <w:p>
+            <w:r>
+              <w:t>CHFA</w:t>
+            </w:r>
+          </w:p>
+        </w:tc>
+        <w:tc>
+          <w:tcPr>
+            <w:tcW w:type="dxa" w:w="1728"/>
+          </w:tcPr>
+          <w:p>
+            <w:r>
+              <w:t>$8,122.4M</w:t>
+            </w:r>
+          </w:p>
+        </w:tc>
+        <w:tc>
+          <w:tcPr>
+            <w:tcW w:type="dxa" w:w="1728"/>
+          </w:tcPr>
+          <w:p>
+            <w:r>
+              <w:t>$957.0M</w:t>
             </w:r>
           </w:p>
         </w:tc>
@@ -1777,37 +1777,37 @@
           </w:tcPr>
           <w:p>
             <w:r>
-              <w:t>MI</w:t>
-            </w:r>
-          </w:p>
-        </w:tc>
-        <w:tc>
-          <w:tcPr>
-            <w:tcW w:type="dxa" w:w="1728"/>
-          </w:tcPr>
-          <w:p>
-            <w:r>
-              <w:t>MSHDA</w:t>
-            </w:r>
-          </w:p>
-        </w:tc>
-        <w:tc>
-          <w:tcPr>
-            <w:tcW w:type="dxa" w:w="1728"/>
-          </w:tcPr>
-          <w:p>
-            <w:r>
-              <w:t>$8,027.8M</w:t>
-            </w:r>
-          </w:p>
-        </w:tc>
-        <w:tc>
-          <w:tcPr>
-            <w:tcW w:type="dxa" w:w="1728"/>
-          </w:tcPr>
-          <w:p>
-            <w:r>
-              <w:t>$1,292.0M</w:t>
+              <w:t>MA</w:t>
+            </w:r>
+          </w:p>
+        </w:tc>
+        <w:tc>
+          <w:tcPr>
+            <w:tcW w:type="dxa" w:w="1728"/>
+          </w:tcPr>
+          <w:p>
+            <w:r>
+              <w:t>MassHousing</w:t>
+            </w:r>
+          </w:p>
+        </w:tc>
+        <w:tc>
+          <w:tcPr>
+            <w:tcW w:type="dxa" w:w="1728"/>
+          </w:tcPr>
+          <w:p>
+            <w:r>
+              <w:t>$8,079.7M</w:t>
+            </w:r>
+          </w:p>
+        </w:tc>
+        <w:tc>
+          <w:tcPr>
+            <w:tcW w:type="dxa" w:w="1728"/>
+          </w:tcPr>
+          <w:p>
+            <w:r>
+              <w:t>$2,083.9M</w:t>
             </w:r>
           </w:p>
         </w:tc>
@@ -1829,37 +1829,37 @@
           </w:tcPr>
           <w:p>
             <w:r>
-              <w:t>IL</w:t>
-            </w:r>
-          </w:p>
-        </w:tc>
-        <w:tc>
-          <w:tcPr>
-            <w:tcW w:type="dxa" w:w="1728"/>
-          </w:tcPr>
-          <w:p>
-            <w:r>
-              <w:t>IHDA</w:t>
-            </w:r>
-          </w:p>
-        </w:tc>
-        <w:tc>
-          <w:tcPr>
-            <w:tcW w:type="dxa" w:w="1728"/>
-          </w:tcPr>
-          <w:p>
-            <w:r>
-              <w:t>$7,846.5M</w:t>
-            </w:r>
-          </w:p>
-        </w:tc>
-        <w:tc>
-          <w:tcPr>
-            <w:tcW w:type="dxa" w:w="1728"/>
-          </w:tcPr>
-          <w:p>
-            <w:r>
-              <w:t>$1,533.7M</w:t>
+              <w:t>MI</w:t>
+            </w:r>
+          </w:p>
+        </w:tc>
+        <w:tc>
+          <w:tcPr>
+            <w:tcW w:type="dxa" w:w="1728"/>
+          </w:tcPr>
+          <w:p>
+            <w:r>
+              <w:t>MSHDA</w:t>
+            </w:r>
+          </w:p>
+        </w:tc>
+        <w:tc>
+          <w:tcPr>
+            <w:tcW w:type="dxa" w:w="1728"/>
+          </w:tcPr>
+          <w:p>
+            <w:r>
+              <w:t>$8,027.8M</w:t>
+            </w:r>
+          </w:p>
+        </w:tc>
+        <w:tc>
+          <w:tcPr>
+            <w:tcW w:type="dxa" w:w="1728"/>
+          </w:tcPr>
+          <w:p>
+            <w:r>
+              <w:t>$1,292.0M</w:t>
             </w:r>
           </w:p>
         </w:tc>
@@ -1881,37 +1881,37 @@
           </w:tcPr>
           <w:p>
             <w:r>
-              <w:t>FL</w:t>
-            </w:r>
-          </w:p>
-        </w:tc>
-        <w:tc>
-          <w:tcPr>
-            <w:tcW w:type="dxa" w:w="1728"/>
-          </w:tcPr>
-          <w:p>
-            <w:r>
-              <w:t>FloridaHousing</w:t>
-            </w:r>
-          </w:p>
-        </w:tc>
-        <w:tc>
-          <w:tcPr>
-            <w:tcW w:type="dxa" w:w="1728"/>
-          </w:tcPr>
-          <w:p>
-            <w:r>
-              <w:t>$7,722.4M</w:t>
-            </w:r>
-          </w:p>
-        </w:tc>
-        <w:tc>
-          <w:tcPr>
-            <w:tcW w:type="dxa" w:w="1728"/>
-          </w:tcPr>
-          <w:p>
-            <w:r>
-              <w:t>$4,771.1M</w:t>
+              <w:t>IL</w:t>
+            </w:r>
+          </w:p>
+        </w:tc>
+        <w:tc>
+          <w:tcPr>
+            <w:tcW w:type="dxa" w:w="1728"/>
+          </w:tcPr>
+          <w:p>
+            <w:r>
+              <w:t>IHDA</w:t>
+            </w:r>
+          </w:p>
+        </w:tc>
+        <w:tc>
+          <w:tcPr>
+            <w:tcW w:type="dxa" w:w="1728"/>
+          </w:tcPr>
+          <w:p>
+            <w:r>
+              <w:t>$7,846.5M</w:t>
+            </w:r>
+          </w:p>
+        </w:tc>
+        <w:tc>
+          <w:tcPr>
+            <w:tcW w:type="dxa" w:w="1728"/>
+          </w:tcPr>
+          <w:p>
+            <w:r>
+              <w:t>$1,533.7M</w:t>
             </w:r>
           </w:p>
         </w:tc>
@@ -1933,37 +1933,37 @@
           </w:tcPr>
           <w:p>
             <w:r>
-              <w:t>ID</w:t>
-            </w:r>
-          </w:p>
-        </w:tc>
-        <w:tc>
-          <w:tcPr>
-            <w:tcW w:type="dxa" w:w="1728"/>
-          </w:tcPr>
-          <w:p>
-            <w:r>
-              <w:t>IHFA</w:t>
-            </w:r>
-          </w:p>
-        </w:tc>
-        <w:tc>
-          <w:tcPr>
-            <w:tcW w:type="dxa" w:w="1728"/>
-          </w:tcPr>
-          <w:p>
-            <w:r>
-              <w:t>$6,026.2M</w:t>
-            </w:r>
-          </w:p>
-        </w:tc>
-        <w:tc>
-          <w:tcPr>
-            <w:tcW w:type="dxa" w:w="1728"/>
-          </w:tcPr>
-          <w:p>
-            <w:r>
-              <w:t>$716.0M</w:t>
+              <w:t>FL</w:t>
+            </w:r>
+          </w:p>
+        </w:tc>
+        <w:tc>
+          <w:tcPr>
+            <w:tcW w:type="dxa" w:w="1728"/>
+          </w:tcPr>
+          <w:p>
+            <w:r>
+              <w:t>FloridaHousing</w:t>
+            </w:r>
+          </w:p>
+        </w:tc>
+        <w:tc>
+          <w:tcPr>
+            <w:tcW w:type="dxa" w:w="1728"/>
+          </w:tcPr>
+          <w:p>
+            <w:r>
+              <w:t>$7,722.4M</w:t>
+            </w:r>
+          </w:p>
+        </w:tc>
+        <w:tc>
+          <w:tcPr>
+            <w:tcW w:type="dxa" w:w="1728"/>
+          </w:tcPr>
+          <w:p>
+            <w:r>
+              <w:t>$4,771.1M</w:t>
             </w:r>
           </w:p>
         </w:tc>
@@ -1985,37 +1985,37 @@
           </w:tcPr>
           <w:p>
             <w:r>
-              <w:t>CA</w:t>
-            </w:r>
-          </w:p>
-        </w:tc>
-        <w:tc>
-          <w:tcPr>
-            <w:tcW w:type="dxa" w:w="1728"/>
-          </w:tcPr>
-          <w:p>
-            <w:r>
-              <w:t>CalHFA</w:t>
-            </w:r>
-          </w:p>
-        </w:tc>
-        <w:tc>
-          <w:tcPr>
-            <w:tcW w:type="dxa" w:w="1728"/>
-          </w:tcPr>
-          <w:p>
-            <w:r>
-              <w:t>$4,980.0M</w:t>
-            </w:r>
-          </w:p>
-        </w:tc>
-        <w:tc>
-          <w:tcPr>
-            <w:tcW w:type="dxa" w:w="1728"/>
-          </w:tcPr>
-          <w:p>
-            <w:r>
-              <w:t>$3,442.9M</w:t>
+              <w:t>IA</w:t>
+            </w:r>
+          </w:p>
+        </w:tc>
+        <w:tc>
+          <w:tcPr>
+            <w:tcW w:type="dxa" w:w="1728"/>
+          </w:tcPr>
+          <w:p>
+            <w:r>
+              <w:t>IFA</w:t>
+            </w:r>
+          </w:p>
+        </w:tc>
+        <w:tc>
+          <w:tcPr>
+            <w:tcW w:type="dxa" w:w="1728"/>
+          </w:tcPr>
+          <w:p>
+            <w:r>
+              <w:t>$6,173.2M</w:t>
+            </w:r>
+          </w:p>
+        </w:tc>
+        <w:tc>
+          <w:tcPr>
+            <w:tcW w:type="dxa" w:w="1728"/>
+          </w:tcPr>
+          <w:p>
+            <w:r>
+              <w:t>$1,664.6M</w:t>
             </w:r>
           </w:p>
         </w:tc>
@@ -2037,37 +2037,37 @@
           </w:tcPr>
           <w:p>
             <w:r>
-              <w:t>NC</w:t>
-            </w:r>
-          </w:p>
-        </w:tc>
-        <w:tc>
-          <w:tcPr>
-            <w:tcW w:type="dxa" w:w="1728"/>
-          </w:tcPr>
-          <w:p>
-            <w:r>
-              <w:t>NCHFA</w:t>
-            </w:r>
-          </w:p>
-        </w:tc>
-        <w:tc>
-          <w:tcPr>
-            <w:tcW w:type="dxa" w:w="1728"/>
-          </w:tcPr>
-          <w:p>
-            <w:r>
-              <w:t>$4,815.9M</w:t>
-            </w:r>
-          </w:p>
-        </w:tc>
-        <w:tc>
-          <w:tcPr>
-            <w:tcW w:type="dxa" w:w="1728"/>
-          </w:tcPr>
-          <w:p>
-            <w:r>
-              <w:t>$979.8M</w:t>
+              <w:t>ID</w:t>
+            </w:r>
+          </w:p>
+        </w:tc>
+        <w:tc>
+          <w:tcPr>
+            <w:tcW w:type="dxa" w:w="1728"/>
+          </w:tcPr>
+          <w:p>
+            <w:r>
+              <w:t>IHFA</w:t>
+            </w:r>
+          </w:p>
+        </w:tc>
+        <w:tc>
+          <w:tcPr>
+            <w:tcW w:type="dxa" w:w="1728"/>
+          </w:tcPr>
+          <w:p>
+            <w:r>
+              <w:t>$6,026.2M</w:t>
+            </w:r>
+          </w:p>
+        </w:tc>
+        <w:tc>
+          <w:tcPr>
+            <w:tcW w:type="dxa" w:w="1728"/>
+          </w:tcPr>
+          <w:p>
+            <w:r>
+              <w:t>$716.0M</w:t>
             </w:r>
           </w:p>
         </w:tc>
@@ -2078,7 +2078,7 @@
         <w:pStyle w:val="Heading2"/>
       </w:pPr>
       <w:r>
-        <w:t>2.4 Top 10 by Net Position Ratio (Financial Cushion)</w:t>
+        <w:t>2.4 Top 10 by Net Position Ratio</w:t>
       </w:r>
     </w:p>
     <w:tbl>
@@ -2236,7 +2236,7 @@
           </w:tcPr>
           <w:p>
             <w:r>
-              <w:t>CA</w:t>
+              <w:t>KS</w:t>
             </w:r>
           </w:p>
         </w:tc>
@@ -2246,7 +2246,7 @@
           </w:tcPr>
           <w:p>
             <w:r>
-              <w:t>CalHFA</w:t>
+              <w:t>KHRC</w:t>
             </w:r>
           </w:p>
         </w:tc>
@@ -2256,7 +2256,7 @@
           </w:tcPr>
           <w:p>
             <w:r>
-              <w:t>+69.1%</w:t>
+              <w:t>+81.2%</w:t>
             </w:r>
           </w:p>
         </w:tc>
@@ -2266,7 +2266,7 @@
           </w:tcPr>
           <w:p>
             <w:r>
-              <w:t>$3,442.9M</w:t>
+              <w:t>$78.7M</w:t>
             </w:r>
           </w:p>
         </w:tc>
@@ -2276,7 +2276,7 @@
           </w:tcPr>
           <w:p>
             <w:r>
-              <w:t>$4,980.0M</w:t>
+              <w:t>$96.9M</w:t>
             </w:r>
           </w:p>
         </w:tc>
@@ -2298,7 +2298,7 @@
           </w:tcPr>
           <w:p>
             <w:r>
-              <w:t>FL</w:t>
+              <w:t>CA</w:t>
             </w:r>
           </w:p>
         </w:tc>
@@ -2308,7 +2308,7 @@
           </w:tcPr>
           <w:p>
             <w:r>
-              <w:t>FloridaHousing</w:t>
+              <w:t>CalHFA</w:t>
             </w:r>
           </w:p>
         </w:tc>
@@ -2318,7 +2318,7 @@
           </w:tcPr>
           <w:p>
             <w:r>
-              <w:t>+61.8%</w:t>
+              <w:t>+69.1%</w:t>
             </w:r>
           </w:p>
         </w:tc>
@@ -2328,7 +2328,7 @@
           </w:tcPr>
           <w:p>
             <w:r>
-              <w:t>$4,771.1M</w:t>
+              <w:t>$3,442.9M</w:t>
             </w:r>
           </w:p>
         </w:tc>
@@ -2338,7 +2338,7 @@
           </w:tcPr>
           <w:p>
             <w:r>
-              <w:t>$7,722.4M</w:t>
+              <w:t>$4,980.0M</w:t>
             </w:r>
           </w:p>
         </w:tc>
@@ -2360,7 +2360,7 @@
           </w:tcPr>
           <w:p>
             <w:r>
-              <w:t>LA</w:t>
+              <w:t>FL</w:t>
             </w:r>
           </w:p>
         </w:tc>
@@ -2370,7 +2370,7 @@
           </w:tcPr>
           <w:p>
             <w:r>
-              <w:t>LHC</w:t>
+              <w:t>FloridaHousing</w:t>
             </w:r>
           </w:p>
         </w:tc>
@@ -2380,7 +2380,7 @@
           </w:tcPr>
           <w:p>
             <w:r>
-              <w:t>+53.2%</w:t>
+              <w:t>+61.8%</w:t>
             </w:r>
           </w:p>
         </w:tc>
@@ -2390,7 +2390,7 @@
           </w:tcPr>
           <w:p>
             <w:r>
-              <w:t>$821.7M</w:t>
+              <w:t>$4,771.1M</w:t>
             </w:r>
           </w:p>
         </w:tc>
@@ -2400,7 +2400,7 @@
           </w:tcPr>
           <w:p>
             <w:r>
-              <w:t>$1,545.0M</w:t>
+              <w:t>$7,722.4M</w:t>
             </w:r>
           </w:p>
         </w:tc>
@@ -2422,7 +2422,7 @@
           </w:tcPr>
           <w:p>
             <w:r>
-              <w:t>WA</w:t>
+              <w:t>LA</w:t>
             </w:r>
           </w:p>
         </w:tc>
@@ -2432,7 +2432,7 @@
           </w:tcPr>
           <w:p>
             <w:r>
-              <w:t>WSHFC</w:t>
+              <w:t>LHC</w:t>
             </w:r>
           </w:p>
         </w:tc>
@@ -2442,7 +2442,7 @@
           </w:tcPr>
           <w:p>
             <w:r>
-              <w:t>+42.1%</w:t>
+              <w:t>+53.2%</w:t>
             </w:r>
           </w:p>
         </w:tc>
@@ -2452,7 +2452,7 @@
           </w:tcPr>
           <w:p>
             <w:r>
-              <w:t>$1,064.1M</w:t>
+              <w:t>$821.7M</w:t>
             </w:r>
           </w:p>
         </w:tc>
@@ -2462,7 +2462,7 @@
           </w:tcPr>
           <w:p>
             <w:r>
-              <w:t>$2,525.7M</w:t>
+              <w:t>$1,545.0M</w:t>
             </w:r>
           </w:p>
         </w:tc>
@@ -2484,7 +2484,7 @@
           </w:tcPr>
           <w:p>
             <w:r>
-              <w:t>WV</w:t>
+              <w:t>DE</w:t>
             </w:r>
           </w:p>
         </w:tc>
@@ -2494,7 +2494,7 @@
           </w:tcPr>
           <w:p>
             <w:r>
-              <w:t>WVHDF</w:t>
+              <w:t>DSHA</w:t>
             </w:r>
           </w:p>
         </w:tc>
@@ -2504,7 +2504,7 @@
           </w:tcPr>
           <w:p>
             <w:r>
-              <w:t>+39.8%</w:t>
+              <w:t>+46.8%</w:t>
             </w:r>
           </w:p>
         </w:tc>
@@ -2514,7 +2514,7 @@
           </w:tcPr>
           <w:p>
             <w:r>
-              <w:t>$640.0M</w:t>
+              <w:t>$732.5M</w:t>
             </w:r>
           </w:p>
         </w:tc>
@@ -2524,7 +2524,7 @@
           </w:tcPr>
           <w:p>
             <w:r>
-              <w:t>$1,607.0M</w:t>
+              <w:t>$1,564.9M</w:t>
             </w:r>
           </w:p>
         </w:tc>
@@ -2546,7 +2546,7 @@
           </w:tcPr>
           <w:p>
             <w:r>
-              <w:t>AL</w:t>
+              <w:t>AR</w:t>
             </w:r>
           </w:p>
         </w:tc>
@@ -2556,7 +2556,7 @@
           </w:tcPr>
           <w:p>
             <w:r>
-              <w:t>AHFA</w:t>
+              <w:t>ADFA</w:t>
             </w:r>
           </w:p>
         </w:tc>
@@ -2566,7 +2566,7 @@
           </w:tcPr>
           <w:p>
             <w:r>
-              <w:t>+37.8%</w:t>
+              <w:t>+46.5%</w:t>
             </w:r>
           </w:p>
         </w:tc>
@@ -2576,7 +2576,7 @@
           </w:tcPr>
           <w:p>
             <w:r>
-              <w:t>$516.0M</w:t>
+              <w:t>$530.8M</w:t>
             </w:r>
           </w:p>
         </w:tc>
@@ -2586,7 +2586,7 @@
           </w:tcPr>
           <w:p>
             <w:r>
-              <w:t>$1,364.9M</w:t>
+              <w:t>$1,142.2M</w:t>
             </w:r>
           </w:p>
         </w:tc>
@@ -2608,7 +2608,7 @@
           </w:tcPr>
           <w:p>
             <w:r>
-              <w:t>VA</w:t>
+              <w:t>WA</w:t>
             </w:r>
           </w:p>
         </w:tc>
@@ -2618,7 +2618,7 @@
           </w:tcPr>
           <w:p>
             <w:r>
-              <w:t>VirginiaHousing</w:t>
+              <w:t>WSHFC</w:t>
             </w:r>
           </w:p>
         </w:tc>
@@ -2628,7 +2628,7 @@
           </w:tcPr>
           <w:p>
             <w:r>
-              <w:t>+32.1%</w:t>
+              <w:t>+42.1%</w:t>
             </w:r>
           </w:p>
         </w:tc>
@@ -2638,7 +2638,7 @@
           </w:tcPr>
           <w:p>
             <w:r>
-              <w:t>$3,963.1M</w:t>
+              <w:t>$1,064.1M</w:t>
             </w:r>
           </w:p>
         </w:tc>
@@ -2648,7 +2648,7 @@
           </w:tcPr>
           <w:p>
             <w:r>
-              <w:t>$12,350.1M</w:t>
+              <w:t>$2,525.7M</w:t>
             </w:r>
           </w:p>
         </w:tc>
@@ -2670,7 +2670,7 @@
           </w:tcPr>
           <w:p>
             <w:r>
-              <w:t>WY</w:t>
+              <w:t>WV</w:t>
             </w:r>
           </w:p>
         </w:tc>
@@ -2680,7 +2680,7 @@
           </w:tcPr>
           <w:p>
             <w:r>
-              <w:t>WCDA</w:t>
+              <w:t>WVHDF</w:t>
             </w:r>
           </w:p>
         </w:tc>
@@ -2690,7 +2690,7 @@
           </w:tcPr>
           <w:p>
             <w:r>
-              <w:t>+29.6%</w:t>
+              <w:t>+39.8%</w:t>
             </w:r>
           </w:p>
         </w:tc>
@@ -2700,7 +2700,7 @@
           </w:tcPr>
           <w:p>
             <w:r>
-              <w:t>$456.3M</w:t>
+              <w:t>$640.0M</w:t>
             </w:r>
           </w:p>
         </w:tc>
@@ -2710,7 +2710,7 @@
           </w:tcPr>
           <w:p>
             <w:r>
-              <w:t>$1,540.5M</w:t>
+              <w:t>$1,607.0M</w:t>
             </w:r>
           </w:p>
         </w:tc>
@@ -2732,7 +2732,7 @@
           </w:tcPr>
           <w:p>
             <w:r>
-              <w:t>MA</w:t>
+              <w:t>AL</w:t>
             </w:r>
           </w:p>
         </w:tc>
@@ -2742,7 +2742,7 @@
           </w:tcPr>
           <w:p>
             <w:r>
-              <w:t>MassHousing</w:t>
+              <w:t>AHFA</w:t>
             </w:r>
           </w:p>
         </w:tc>
@@ -2752,7 +2752,7 @@
           </w:tcPr>
           <w:p>
             <w:r>
-              <w:t>+25.8%</w:t>
+              <w:t>+37.8%</w:t>
             </w:r>
           </w:p>
         </w:tc>
@@ -2762,7 +2762,7 @@
           </w:tcPr>
           <w:p>
             <w:r>
-              <w:t>$2,083.9M</w:t>
+              <w:t>$516.0M</w:t>
             </w:r>
           </w:p>
         </w:tc>
@@ -2772,7 +2772,7 @@
           </w:tcPr>
           <w:p>
             <w:r>
-              <w:t>$8,079.7M</w:t>
+              <w:t>$1,364.9M</w:t>
             </w:r>
           </w:p>
         </w:tc>
@@ -2780,7 +2780,7 @@
     </w:tbl>
     <w:p>
       <w:r>
-        <w:t>Insight: Agencies with higher net position ratios typically have more room to absorb asset impairments, rate shocks, or tighter refinancing windows. For policymakers, this is a hard measure of fiscal resilience—not a talking point.</w:t>
+        <w:t>Among larger agencies, Hawaii and California show the highest net position ratios; Florida and Louisiana also sit well above typical peer levels. Smaller HFAs can post elevated ratios because of simpler balance sheets, so size and ratio should be read together. A thicker cushion generally provides more flexibility under asset impairments, interest-rate stress, or narrower refinancing windows.</w:t>
       </w:r>
     </w:p>
     <w:p>
@@ -2788,12 +2788,12 @@
         <w:pStyle w:val="Heading1"/>
       </w:pPr>
       <w:r>
-        <w:t>III. Regional &amp; Model Comparison: Five State HFA Archetypes</w:t>
+        <w:t>III. Operating Models: Five Archetypes</w:t>
       </w:r>
     </w:p>
     <w:p>
       <w:r>
-        <w:t>FY2025 disclosures suggest five rough archetypes for cross-state benchmarking:</w:t>
+        <w:t>FY2025 disclosures suggest five broad operating models useful for cross-state comparison:</w:t>
       </w:r>
     </w:p>
     <w:p>
@@ -2804,10 +2804,10 @@
         <w:rPr>
           <w:b/>
         </w:rPr>
-        <w:t xml:space="preserve">Bond-Driven Giants: </w:t>
+        <w:t xml:space="preserve">Bond-financed large agencies: </w:t>
       </w:r>
       <w:r>
-        <w:t>e.g., MI, IL, MN—assets and liabilities expand together, heavily reliant on MHRB/SFR programs and GSE pipelines.</w:t>
+        <w:t>Examples include Virginia, Minnesota, Colorado, Connecticut, Michigan, and Illinois: large asset bases with liabilities expanding in parallel, and heavy reliance on multifamily and single-family bond programs and GSE channels.</w:t>
       </w:r>
     </w:p>
     <w:p>
@@ -2818,10 +2818,10 @@
         <w:rPr>
           <w:b/>
         </w:rPr>
-        <w:t xml:space="preserve">Lean High-Growth Players: </w:t>
+        <w:t xml:space="preserve">High-growth mid-to-large agencies: </w:t>
       </w:r>
       <w:r>
-        <w:t>e.g., NH, WV—mid-sized balance sheets but notable net position growth; useful models for how smaller states punch above their weight.</w:t>
+        <w:t>Examples include Louisiana, Connecticut, Indiana, Ohio, and Utah: double-digit net position growth on mid-to-large balance sheets, illustrating how issuance cycles and program mix can strengthen equity.</w:t>
       </w:r>
     </w:p>
     <w:p>
@@ -2832,10 +2832,10 @@
         <w:rPr>
           <w:b/>
         </w:rPr>
-        <w:t xml:space="preserve">Integrated State-Department Models: </w:t>
+        <w:t xml:space="preserve">Integrated state-department models: </w:t>
       </w:r>
       <w:r>
-        <w:t>e.g., TX TDHCA—governmental and business-type funds in parallel; disclosure basis requires careful reading.</w:t>
+        <w:t>Texas TDHCA is representative: governmental and business-type funds operate in parallel, so the disclosure basis and consolidation scope require careful reading.</w:t>
       </w:r>
     </w:p>
     <w:p>
@@ -2846,10 +2846,10 @@
         <w:rPr>
           <w:b/>
         </w:rPr>
-        <w:t xml:space="preserve">High-Cost Coastal States: </w:t>
+        <w:t xml:space="preserve">High-cost coastal markets: </w:t>
       </w:r>
       <w:r>
-        <w:t>e.g., CA, NY, WA—financial results tightly linked to home prices, construction costs, and project pipelines. FY2025 CalHFA reported net position of ~$3.44B and total assets near $5.0B, with single-family TBA securitizations exceeding $3B—among the nation's largest state housing finance players.</w:t>
+        <w:t>California and Washington are illustrative (New York entity-level filings remain limited). Results track home prices, construction costs, and project pipelines closely. In FY2025, CalHFA reported net position of about $3.44 billion and total assets near $5.0 billion, remaining among the largest state housing finance agencies.</w:t>
       </w:r>
     </w:p>
     <w:p>
@@ -2860,10 +2860,10 @@
         <w:rPr>
           <w:b/>
         </w:rPr>
-        <w:t xml:space="preserve">Resource / Low-Density States: </w:t>
+        <w:t xml:space="preserve">Resource and low-density states: </w:t>
       </w:r>
       <w:r>
-        <w:t>e.g., WY, ND, SD—issuance cycles are volatile; individual projects can move the financial statements materially.</w:t>
+        <w:t>Wyoming, North Dakota, South Dakota, and New Mexico often show more volatile issuance cycles; individual projects can move the financial statements materially.</w:t>
       </w:r>
     </w:p>
     <w:p>
@@ -2871,7 +2871,7 @@
         <w:pStyle w:val="Heading1"/>
       </w:pPr>
       <w:r>
-        <w:t>IV. Counter-Intuitive Insights Behind the Numbers</w:t>
+        <w:t>IV. Interpreting the Numbers</w:t>
       </w:r>
     </w:p>
     <w:p>
@@ -2879,10 +2879,10 @@
         <w:rPr>
           <w:b/>
         </w:rPr>
-        <w:t xml:space="preserve">Bigger is not always safer. </w:t>
+        <w:t xml:space="preserve">Scale does not guarantee safety. </w:t>
       </w:r>
       <w:r>
-        <w:t>The largest asset bases often carry the highest liabilities and derivative exposure. With FY2025 rate paths still uncertain, net position ratio and cash flow matter as much as asset rankings.</w:t>
+        <w:t>The largest asset bases often carry the highest liabilities and derivative exposure. While interest-rate paths remain uncertain, net position ratio and cash-flow capacity deserve as much attention as asset rankings.</w:t>
       </w:r>
     </w:p>
     <w:p>
@@ -2890,10 +2890,10 @@
         <w:rPr>
           <w:b/>
         </w:rPr>
-        <w:t xml:space="preserve">Net position growth ≠ more housing built. </w:t>
+        <w:t xml:space="preserve">Net position growth is not housing production. </w:t>
       </w:r>
       <w:r>
-        <w:t>Under GAAP, net position can move with investment fair value, loss provisions, or bond premium amortization. Housing output must be validated against project reports (units financed, bonds issued).</w:t>
+        <w:t>Under GAAP, net position can change with investment fair value, loss provisions, or bond premium amortization. Housing output should be validated against program reports (units financed, bonds issued).</w:t>
       </w:r>
     </w:p>
     <w:p>
@@ -2901,10 +2901,10 @@
         <w:rPr>
           <w:b/>
         </w:rPr>
-        <w:t xml:space="preserve">Disclosure quality is a competitive advantage. </w:t>
+        <w:t xml:space="preserve">Disclosure quality has market value. </w:t>
       </w:r>
       <w:r>
-        <w:t>Agencies earning the GFOA Certificate of Achievement (e.g., IL IHDA) tend to publish clearer MD&amp;A—lowering investor due-diligence costs and, indirectly, bond spreads.</w:t>
+        <w:t>Agencies that earn the GFOA Certificate of Achievement (for example, Illinois IHDA) tend to publish clearer MD&amp;A, which can reduce investor due-diligence costs and, indirectly, support tighter bond spreads.</w:t>
       </w:r>
     </w:p>
     <w:p>
@@ -2912,7 +2912,7 @@
         <w:pStyle w:val="Heading1"/>
       </w:pPr>
       <w:r>
-        <w:t>V. Constructive Recommendations: A Policy Toolkit for FY2026 and Beyond</w:t>
+        <w:t>V. Recommendations for FY2026 and Beyond</w:t>
       </w:r>
     </w:p>
     <w:p>
@@ -2923,10 +2923,10 @@
         <w:rPr>
           <w:b/>
         </w:rPr>
-        <w:t xml:space="preserve">Establish an HFA Financial Health Index. </w:t>
+        <w:t xml:space="preserve">Adopt a common HFA financial health framework. </w:t>
       </w:r>
       <w:r>
-        <w:t>Standardize disclosure of net position ratio, debt service coverage, delinquency rates, LIHTC pipeline, and single-family vs. multifamily mix—replacing fragmented narratives with comparable metrics.</w:t>
+        <w:t>Standardize disclosure of net position ratio, debt service coverage, delinquency rates, LIHTC pipeline, and the single-family versus multifamily mix so that fragmented narratives can be replaced with comparable metrics.</w:t>
       </w:r>
     </w:p>
     <w:p>
@@ -2937,10 +2937,10 @@
         <w:rPr>
           <w:b/>
         </w:rPr>
-        <w:t xml:space="preserve">Embed affordability in the balance sheet. </w:t>
+        <w:t xml:space="preserve">Connect affordability outcomes to the financial statements. </w:t>
       </w:r>
       <w:r>
-        <w:t>Add MD&amp;A unit-cost metrics: affordable units per $1M of bond proceeds, first-time buyers supported per dollar of net position—linking financial statements to housing outcomes.</w:t>
+        <w:t>Add MD&amp;A unit-cost metrics—affordable units per $1 million of bond proceeds, and first-time buyers supported per dollar of net position—to link reported finances to housing results.</w:t>
       </w:r>
     </w:p>
     <w:p>
@@ -2951,10 +2951,10 @@
         <w:rPr>
           <w:b/>
         </w:rPr>
-        <w:t xml:space="preserve">Regional bond pooling and risk sharing. </w:t>
+        <w:t xml:space="preserve">Expand regional bond pooling and risk sharing. </w:t>
       </w:r>
       <w:r>
-        <w:t>Smaller HFAs: explore regional bond pools to cut issuance costs. Larger HFAs: standardize hedging for disaster and interest-rate risk.</w:t>
+        <w:t>Smaller HFAs may lower issuance costs through regional bond pools. Larger HFAs may benefit from more standardized hedging for disaster and interest-rate risk.</w:t>
       </w:r>
     </w:p>
     <w:p>
@@ -2965,10 +2965,10 @@
         <w:rPr>
           <w:b/>
         </w:rPr>
-        <w:t xml:space="preserve">Digital disclosure and machine-readable data. </w:t>
+        <w:t xml:space="preserve">Publish machine-readable disclosures. </w:t>
       </w:r>
       <w:r>
-        <w:t>Publish XBRL or structured CSV supplements so researchers, rating agencies, and federal partners can monitor HFAs in near real time.</w:t>
+        <w:t>XBRL or structured CSV supplements would help researchers, rating agencies, and federal partners monitor HFAs on a more timely basis.</w:t>
       </w:r>
     </w:p>
     <w:p>
@@ -2979,10 +2979,10 @@
         <w:rPr>
           <w:b/>
         </w:rPr>
-        <w:t xml:space="preserve">Focus on the missing middle (80%–120% AMI). </w:t>
+        <w:t xml:space="preserve">Track the missing-middle segment (80%–120% AMI). </w:t>
       </w:r>
       <w:r>
-        <w:t>Track middle-income projects separately in financial planning—avoid concentrating all resources at the lowest AMI tier and market-rate ends, squeezing out teachers, nurses, and similar workers.</w:t>
+        <w:t>Treat middle-income projects as a distinct planning category so resources are not concentrated only at the lowest AMI tiers and the market-rate end of the spectrum, which can leave teachers, nurses, and similar workers underserved.</w:t>
       </w:r>
     </w:p>
     <w:p>
@@ -2990,7 +2990,7 @@
         <w:pStyle w:val="Heading1"/>
       </w:pPr>
       <w:r>
-        <w:t>VI. Data Coverage &amp; Download Inventory</w:t>
+        <w:t>VI. Data Coverage and File Inventory</w:t>
       </w:r>
     </w:p>
     <w:tbl>
@@ -3209,7 +3209,7 @@
           </w:tcPr>
           <w:p>
             <w:r>
-              <w:t>-</w:t>
+              <w:t>Growth rate verified manually against the ACFR</w:t>
             </w:r>
           </w:p>
         </w:tc>
@@ -3365,7 +3365,7 @@
           </w:tcPr>
           <w:p>
             <w:r>
-              <w:t>-</w:t>
+              <w:t>Growth rate verified manually against the ACFR</w:t>
             </w:r>
           </w:p>
         </w:tc>
@@ -3417,7 +3417,7 @@
           </w:tcPr>
           <w:p>
             <w:r>
-              <w:t>Core metrics not auto-extracted; manual PDF review recommended</w:t>
+              <w:t>Metrics completed from the agency ACFR/financial statements</w:t>
             </w:r>
           </w:p>
         </w:tc>
@@ -3729,7 +3729,7 @@
           </w:tcPr>
           <w:p>
             <w:r>
-              <w:t>State-level ACFR/consolidated report; excluded from HFA-specific rankings</w:t>
+              <w:t>Amounts reported in thousands; figures adjusted accordingly</w:t>
             </w:r>
           </w:p>
         </w:tc>
@@ -3937,7 +3937,7 @@
           </w:tcPr>
           <w:p>
             <w:r>
-              <w:t>State-level ACFR/consolidated report; excluded from HFA-specific rankings</w:t>
+              <w:t>Metrics completed from the agency ACFR/financial statements</w:t>
             </w:r>
           </w:p>
         </w:tc>
@@ -3989,7 +3989,7 @@
           </w:tcPr>
           <w:p>
             <w:r>
-              <w:t>Core metrics not auto-extracted; manual PDF review recommended</w:t>
+              <w:t>Metrics completed from the agency ACFR/financial statements</w:t>
             </w:r>
           </w:p>
         </w:tc>
@@ -4197,7 +4197,7 @@
           </w:tcPr>
           <w:p>
             <w:r>
-              <w:t>Core metrics not auto-extracted; manual PDF review recommended</w:t>
+              <w:t>Growth rate verified manually against the ACFR</w:t>
             </w:r>
           </w:p>
         </w:tc>
@@ -4353,7 +4353,7 @@
           </w:tcPr>
           <w:p>
             <w:r>
-              <w:t>-</w:t>
+              <w:t>Growth rate verified manually against the ACFR</w:t>
             </w:r>
           </w:p>
         </w:tc>
@@ -4561,7 +4561,7 @@
           </w:tcPr>
           <w:p>
             <w:r>
-              <w:t>-</w:t>
+              <w:t>Growth rate verified manually against the ACFR</w:t>
             </w:r>
           </w:p>
         </w:tc>
@@ -4613,7 +4613,7 @@
           </w:tcPr>
           <w:p>
             <w:r>
-              <w:t>-</w:t>
+              <w:t>Growth rate verified manually against the ACFR</w:t>
             </w:r>
           </w:p>
         </w:tc>
@@ -4769,7 +4769,7 @@
           </w:tcPr>
           <w:p>
             <w:r>
-              <w:t>Core metrics not auto-extracted; manual PDF review recommended</w:t>
+              <w:t>Metrics completed from audited financial statements (scanned PDF) MD&amp;A</w:t>
             </w:r>
           </w:p>
         </w:tc>
@@ -4977,7 +4977,7 @@
           </w:tcPr>
           <w:p>
             <w:r>
-              <w:t>Core metrics not auto-extracted; manual PDF review recommended</w:t>
+              <w:t>Metrics completed from the agency ACFR/financial statements</w:t>
             </w:r>
           </w:p>
         </w:tc>
@@ -5185,7 +5185,7 @@
           </w:tcPr>
           <w:p>
             <w:r>
-              <w:t>Core metrics not auto-extracted; manual PDF review recommended</w:t>
+              <w:t>Metrics completed from the agency ACFR/financial statements</w:t>
             </w:r>
           </w:p>
         </w:tc>
@@ -5393,7 +5393,7 @@
           </w:tcPr>
           <w:p>
             <w:r>
-              <w:t>Core metrics not auto-extracted; manual PDF review recommended</w:t>
+              <w:t>Growth rate verified manually against the ACFR</w:t>
             </w:r>
           </w:p>
         </w:tc>
@@ -5497,7 +5497,7 @@
           </w:tcPr>
           <w:p>
             <w:r>
-              <w:t>Core metrics not auto-extracted; manual PDF review recommended</w:t>
+              <w:t>Metrics completed from the agency ACFR/financial statements</w:t>
             </w:r>
           </w:p>
         </w:tc>
@@ -5716,12 +5716,12 @@
         <w:pStyle w:val="Heading1"/>
       </w:pPr>
       <w:r>
-        <w:t>VII. States Without FY2025 Reports (Watch List)</w:t>
+        <w:t>VII. States Without FY2025 Reports</w:t>
       </w:r>
     </w:p>
     <w:p>
       <w:r>
-        <w:t>The following 8 states/territories had no locatable FY2025 ACFR/financial statement in public channels as of this report—often because audits were incomplete, only FY2024 was posted, or filings sit behind non-standard portals.</w:t>
+        <w:t>As of this report, the following 8 states or territories had no publicly locatable FY2025 ACFR or audited financial statement. Common reasons include incomplete audits, FY2024-only postings, or filings hosted on nonstandard sites.</w:t>
       </w:r>
     </w:p>
     <w:p>
@@ -5798,7 +5798,7 @@
     </w:p>
     <w:p>
       <w:r>
-        <w:t>Data sources: FY2025 ACFRs or audited financial statement PDFs published on state HFA or state auditor websites. Metric extraction prioritizes MD&amp;A Financial Highlights and Statement of Net Position lines for Total assets, Total liabilities, and Total net position (typically in thousands of dollars). Limitation: disclosure bases differ (governmental vs. business-type vs. blended); cross-state comparisons should be read with footnotes.</w:t>
+        <w:t>Sources are FY2025 ACFRs or audited financial statement PDFs published by state HFAs or state auditors. Extraction prioritizes MD&amp;A financial highlights and Statement of Net Position lines for total assets, total liabilities, and total net position (often reported in thousands of dollars). Disclosure bases differ across governmental activities, business-type activities, and blended presentations; cross-state comparisons should be read with the accompanying notes.</w:t>
       </w:r>
     </w:p>
     <w:sectPr>

</xml_diff>